<commit_message>
Completed Exercise part 3
</commit_message>
<xml_diff>
--- a/use-cases/code-algorithms/java/TaskManager/Code Understanding Journal.docx
+++ b/use-cases/code-algorithms/java/TaskManager/Code Understanding Journal.docx
@@ -271,6 +271,83 @@
       </w:r>
       <w:r>
         <w:t xml:space="preserve"> never knows whether tasks come from a JSON file, a database, or memory.</w:t>
+      </w:r>
+    </w:p>
+    <w:p/>
+    <w:p>
+      <w:r>
+        <w:br w:type="page"/>
+      </w:r>
+    </w:p>
+    <w:p>
+      <w:pPr>
+        <w:pStyle w:val="Heading2"/>
+        <w:pBdr>
+          <w:bottom w:val="single" w:sz="6" w:space="0" w:color="E1E1E1"/>
+        </w:pBdr>
+        <w:shd w:val="clear" w:color="auto" w:fill="FFFFFF"/>
+        <w:rPr>
+          <w:rFonts w:ascii="Roboto" w:hAnsi="Roboto"/>
+          <w:color w:val="191919"/>
+          <w:sz w:val="36"/>
+          <w:szCs w:val="36"/>
+        </w:rPr>
+      </w:pPr>
+      <w:r>
+        <w:rPr>
+          <w:rFonts w:ascii="Roboto" w:hAnsi="Roboto"/>
+          <w:color w:val="191919"/>
+          <w:sz w:val="36"/>
+          <w:szCs w:val="36"/>
+        </w:rPr>
+        <w:lastRenderedPageBreak/>
+        <w:t>Exercise Part 2: Deepen Understanding Through Guided Questions</w:t>
+      </w:r>
+    </w:p>
+    <w:p/>
+    <w:p>
+      <w:r>
+        <w:t>Initial understanding of how task priorities work:</w:t>
+      </w:r>
+    </w:p>
+    <w:p>
+      <w:r>
+        <w:t>The program uses the TaskManager class to manage priorities in tasks. The priority is initially set during task creating in the createTask function of the TaskManager class. It is updating using the updateTaskPriority class which creates an instance of the TaskPriority enumeratio. It then assigns the object with a new priority and then creates a new task to set the new priority to. The new taks is used to update a task within the TaskManager’s storage.</w:t>
+      </w:r>
+    </w:p>
+    <w:p>
+      <w:r>
+        <w:t>Discoveries of how task priorities work:</w:t>
+      </w:r>
+    </w:p>
+    <w:p>
+      <w:r>
+        <w:t>The class does not just create a new class and save it as a replacement. Instead it calls the update method from the TaskStorage class which calls the update method</w:t>
+      </w:r>
+      <w:r>
+        <w:t>, giving it an updated task object. The update method goes through the new task’s attributes and assigns the attributes with values to the original task and saves it in storage.</w:t>
+      </w:r>
+    </w:p>
+    <w:p/>
+    <w:p>
+      <w:r>
+        <w:t>Key Insights:</w:t>
+      </w:r>
+    </w:p>
+    <w:p>
+      <w:r>
+        <w:t>The concept of updating an object by creating a update object and extracting fields with data from it and adding them to the original object. Yet the program does not make use of this sttrategy everytime it needs to update an object.</w:t>
+      </w:r>
+    </w:p>
+    <w:p/>
+    <w:p>
+      <w:r>
+        <w:t>Misconceptions I had:</w:t>
+      </w:r>
+    </w:p>
+    <w:p>
+      <w:r>
+        <w:t>The class does not just create a new class and save it as a replacement.</w:t>
       </w:r>
     </w:p>
     <w:sectPr>

</xml_diff>

<commit_message>
Updates journal with complete exercise part 3
</commit_message>
<xml_diff>
--- a/use-cases/code-algorithms/java/TaskManager/Code Understanding Journal.docx
+++ b/use-cases/code-algorithms/java/TaskManager/Code Understanding Journal.docx
@@ -34,10 +34,42 @@
     </w:p>
     <w:p>
       <w:r>
-        <w:t xml:space="preserve">The TaskManager class controls task creation and status updates. It is located in the </w:t>
-      </w:r>
-      <w:r>
-        <w:t>java/za/co/wethinkcode/taskmanager/app/TaskManager.java</w:t>
+        <w:t xml:space="preserve">The </w:t>
+      </w:r>
+      <w:proofErr w:type="spellStart"/>
+      <w:r>
+        <w:t>TaskManager</w:t>
+      </w:r>
+      <w:proofErr w:type="spellEnd"/>
+      <w:r>
+        <w:t xml:space="preserve"> class controls task creation and status updates. It </w:t>
+      </w:r>
+      <w:proofErr w:type="gramStart"/>
+      <w:r>
+        <w:t>is located in</w:t>
+      </w:r>
+      <w:proofErr w:type="gramEnd"/>
+      <w:r>
+        <w:t xml:space="preserve"> the </w:t>
+      </w:r>
+      <w:r>
+        <w:t>java/za/co/</w:t>
+      </w:r>
+      <w:proofErr w:type="spellStart"/>
+      <w:r>
+        <w:t>wethinkcode</w:t>
+      </w:r>
+      <w:proofErr w:type="spellEnd"/>
+      <w:r>
+        <w:t>/</w:t>
+      </w:r>
+      <w:proofErr w:type="spellStart"/>
+      <w:r>
+        <w:t>taskmanager</w:t>
+      </w:r>
+      <w:proofErr w:type="spellEnd"/>
+      <w:r>
+        <w:t>/app/TaskManager.java</w:t>
       </w:r>
       <w:r>
         <w:t xml:space="preserve"> directory path.</w:t>
@@ -59,8 +91,13 @@
           <w:numId w:val="1"/>
         </w:numPr>
       </w:pPr>
-      <w:r>
-        <w:t>TaskManager class</w:t>
+      <w:proofErr w:type="spellStart"/>
+      <w:r>
+        <w:t>TaskManager</w:t>
+      </w:r>
+      <w:proofErr w:type="spellEnd"/>
+      <w:r>
+        <w:t xml:space="preserve"> class</w:t>
       </w:r>
     </w:p>
     <w:p>
@@ -71,8 +108,13 @@
           <w:numId w:val="1"/>
         </w:numPr>
       </w:pPr>
-      <w:r>
-        <w:t>createTask methods</w:t>
+      <w:proofErr w:type="spellStart"/>
+      <w:r>
+        <w:t>createTask</w:t>
+      </w:r>
+      <w:proofErr w:type="spellEnd"/>
+      <w:r>
+        <w:t xml:space="preserve"> methods</w:t>
       </w:r>
     </w:p>
     <w:p>
@@ -83,8 +125,13 @@
           <w:numId w:val="1"/>
         </w:numPr>
       </w:pPr>
-      <w:r>
-        <w:t>updateTaskStatus methods</w:t>
+      <w:proofErr w:type="spellStart"/>
+      <w:r>
+        <w:t>updateTaskStatus</w:t>
+      </w:r>
+      <w:proofErr w:type="spellEnd"/>
+      <w:r>
+        <w:t xml:space="preserve"> methods</w:t>
       </w:r>
     </w:p>
     <w:p>
@@ -109,7 +156,31 @@
         </w:numPr>
       </w:pPr>
       <w:r>
-        <w:t>The CLI passes the task’s details to TaskManager.createTask() – which is the TaskManager class’ function for creating new task objects.</w:t>
+        <w:t xml:space="preserve">The CLI passes the task’s details to </w:t>
+      </w:r>
+      <w:proofErr w:type="spellStart"/>
+      <w:r>
+        <w:t>TaskManager.createTask</w:t>
+      </w:r>
+      <w:proofErr w:type="spellEnd"/>
+      <w:r>
+        <w:t xml:space="preserve">() – which is the </w:t>
+      </w:r>
+      <w:proofErr w:type="spellStart"/>
+      <w:r>
+        <w:t>TaskManager</w:t>
+      </w:r>
+      <w:proofErr w:type="spellEnd"/>
+      <w:r>
+        <w:t xml:space="preserve"> </w:t>
+      </w:r>
+      <w:proofErr w:type="spellStart"/>
+      <w:r>
+        <w:t>class’</w:t>
+      </w:r>
+      <w:proofErr w:type="spellEnd"/>
+      <w:r>
+        <w:t xml:space="preserve"> function for creating new task objects.</w:t>
       </w:r>
     </w:p>
     <w:p>
@@ -121,7 +192,28 @@
         </w:numPr>
       </w:pPr>
       <w:r>
-        <w:t>The createTask() function instatiates a task object, with information from the CLI.</w:t>
+        <w:t xml:space="preserve">The </w:t>
+      </w:r>
+      <w:proofErr w:type="spellStart"/>
+      <w:proofErr w:type="gramStart"/>
+      <w:r>
+        <w:t>createTask</w:t>
+      </w:r>
+      <w:proofErr w:type="spellEnd"/>
+      <w:r>
+        <w:t>(</w:t>
+      </w:r>
+      <w:proofErr w:type="gramEnd"/>
+      <w:r>
+        <w:t xml:space="preserve">) function </w:t>
+      </w:r>
+      <w:proofErr w:type="spellStart"/>
+      <w:r>
+        <w:t>instatiates</w:t>
+      </w:r>
+      <w:proofErr w:type="spellEnd"/>
+      <w:r>
+        <w:t xml:space="preserve"> a task object, with information from the CLI.</w:t>
       </w:r>
     </w:p>
     <w:p>
@@ -133,7 +225,44 @@
         </w:numPr>
       </w:pPr>
       <w:r>
-        <w:t>The createTask() method calls the getStorage().addTask() method to add the task to the TaskManager’s storage classes to save the task.</w:t>
+        <w:t xml:space="preserve">The </w:t>
+      </w:r>
+      <w:proofErr w:type="spellStart"/>
+      <w:proofErr w:type="gramStart"/>
+      <w:r>
+        <w:t>createTask</w:t>
+      </w:r>
+      <w:proofErr w:type="spellEnd"/>
+      <w:r>
+        <w:t>(</w:t>
+      </w:r>
+      <w:proofErr w:type="gramEnd"/>
+      <w:r>
+        <w:t xml:space="preserve">) method calls the </w:t>
+      </w:r>
+      <w:proofErr w:type="spellStart"/>
+      <w:r>
+        <w:t>getStorage</w:t>
+      </w:r>
+      <w:proofErr w:type="spellEnd"/>
+      <w:r>
+        <w:t>().</w:t>
+      </w:r>
+      <w:proofErr w:type="spellStart"/>
+      <w:r>
+        <w:t>addTask</w:t>
+      </w:r>
+      <w:proofErr w:type="spellEnd"/>
+      <w:r>
+        <w:t xml:space="preserve">() method to add the task to the </w:t>
+      </w:r>
+      <w:proofErr w:type="spellStart"/>
+      <w:r>
+        <w:t>TaskManager’s</w:t>
+      </w:r>
+      <w:proofErr w:type="spellEnd"/>
+      <w:r>
+        <w:t xml:space="preserve"> storage classes to save the task.</w:t>
       </w:r>
     </w:p>
     <w:p>
@@ -150,7 +279,28 @@
         </w:numPr>
       </w:pPr>
       <w:r>
-        <w:t>The CLI passes the command to the TaskManager, calling the updateTaskStatus() method.</w:t>
+        <w:t xml:space="preserve">The CLI passes the command to the </w:t>
+      </w:r>
+      <w:proofErr w:type="spellStart"/>
+      <w:r>
+        <w:t>TaskManager</w:t>
+      </w:r>
+      <w:proofErr w:type="spellEnd"/>
+      <w:r>
+        <w:t xml:space="preserve">, calling the </w:t>
+      </w:r>
+      <w:proofErr w:type="spellStart"/>
+      <w:proofErr w:type="gramStart"/>
+      <w:r>
+        <w:t>updateTaskStatus</w:t>
+      </w:r>
+      <w:proofErr w:type="spellEnd"/>
+      <w:r>
+        <w:t>(</w:t>
+      </w:r>
+      <w:proofErr w:type="gramEnd"/>
+      <w:r>
+        <w:t>) method.</w:t>
       </w:r>
     </w:p>
     <w:p>
@@ -162,7 +312,20 @@
         </w:numPr>
       </w:pPr>
       <w:r>
-        <w:t>The updateTaskStatus() method changes the status of the task and saves it in storage.</w:t>
+        <w:t xml:space="preserve">The </w:t>
+      </w:r>
+      <w:proofErr w:type="spellStart"/>
+      <w:proofErr w:type="gramStart"/>
+      <w:r>
+        <w:t>updateTaskStatus</w:t>
+      </w:r>
+      <w:proofErr w:type="spellEnd"/>
+      <w:r>
+        <w:t>(</w:t>
+      </w:r>
+      <w:proofErr w:type="gramEnd"/>
+      <w:r>
+        <w:t>) method changes the status of the task and saves it in storage.</w:t>
       </w:r>
     </w:p>
     <w:p>
@@ -175,7 +338,55 @@
     </w:p>
     <w:p>
       <w:r>
-        <w:t>Data is stored and retrieved using the TaskStorage class. The TaskStorage class contains a list of all the tasks as well as the path to them in the disk. It is managed using fucntions within this class which can load, add, save, retrieve, update and delete tasks. These methods are accesed by the TaskManager class.</w:t>
+        <w:t xml:space="preserve">Data is stored and retrieved using the </w:t>
+      </w:r>
+      <w:proofErr w:type="spellStart"/>
+      <w:r>
+        <w:t>TaskStorage</w:t>
+      </w:r>
+      <w:proofErr w:type="spellEnd"/>
+      <w:r>
+        <w:t xml:space="preserve"> class. The </w:t>
+      </w:r>
+      <w:proofErr w:type="spellStart"/>
+      <w:r>
+        <w:t>TaskStorage</w:t>
+      </w:r>
+      <w:proofErr w:type="spellEnd"/>
+      <w:r>
+        <w:t xml:space="preserve"> class contains a list of all the tasks as well as the path to them in the disk. It is managed using </w:t>
+      </w:r>
+      <w:proofErr w:type="spellStart"/>
+      <w:r>
+        <w:t>fucntions</w:t>
+      </w:r>
+      <w:proofErr w:type="spellEnd"/>
+      <w:r>
+        <w:t xml:space="preserve"> within this class which can load, add, save, retrieve, </w:t>
+      </w:r>
+      <w:proofErr w:type="gramStart"/>
+      <w:r>
+        <w:t>update</w:t>
+      </w:r>
+      <w:proofErr w:type="gramEnd"/>
+      <w:r>
+        <w:t xml:space="preserve"> and delete tasks. These methods are </w:t>
+      </w:r>
+      <w:proofErr w:type="spellStart"/>
+      <w:r>
+        <w:t>accesed</w:t>
+      </w:r>
+      <w:proofErr w:type="spellEnd"/>
+      <w:r>
+        <w:t xml:space="preserve"> by the </w:t>
+      </w:r>
+      <w:proofErr w:type="spellStart"/>
+      <w:r>
+        <w:t>TaskManager</w:t>
+      </w:r>
+      <w:proofErr w:type="spellEnd"/>
+      <w:r>
+        <w:t xml:space="preserve"> class.</w:t>
       </w:r>
     </w:p>
     <w:p>
@@ -187,6 +398,7 @@
       </w:r>
     </w:p>
     <w:p>
+      <w:proofErr w:type="spellStart"/>
       <w:r>
         <w:rPr>
           <w:rStyle w:val="HTMLCode"/>
@@ -196,9 +408,11 @@
         </w:rPr>
         <w:t>TaskStorage</w:t>
       </w:r>
+      <w:proofErr w:type="spellEnd"/>
       <w:r>
         <w:t xml:space="preserve"> acts as a </w:t>
       </w:r>
+      <w:proofErr w:type="gramStart"/>
       <w:r>
         <w:rPr>
           <w:rStyle w:val="Strong"/>
@@ -216,7 +430,11 @@
         <w:t xml:space="preserve">y, </w:t>
       </w:r>
       <w:r>
-        <w:t xml:space="preserve"> it abstracts the storage </w:t>
+        <w:t xml:space="preserve"> it</w:t>
+      </w:r>
+      <w:proofErr w:type="gramEnd"/>
+      <w:r>
+        <w:t xml:space="preserve"> abstracts the storage </w:t>
       </w:r>
       <w:r>
         <w:t>functionality</w:t>
@@ -224,6 +442,7 @@
       <w:r>
         <w:t xml:space="preserve"> behind a interface (</w:t>
       </w:r>
+      <w:proofErr w:type="spellStart"/>
       <w:r>
         <w:rPr>
           <w:rStyle w:val="HTMLCode"/>
@@ -233,9 +452,11 @@
         </w:rPr>
         <w:t>getTask</w:t>
       </w:r>
+      <w:proofErr w:type="spellEnd"/>
       <w:r>
         <w:t xml:space="preserve">, </w:t>
       </w:r>
+      <w:proofErr w:type="spellStart"/>
       <w:r>
         <w:rPr>
           <w:rStyle w:val="HTMLCode"/>
@@ -245,9 +466,11 @@
         </w:rPr>
         <w:t>getTasksByStatus</w:t>
       </w:r>
+      <w:proofErr w:type="spellEnd"/>
       <w:r>
         <w:t xml:space="preserve">, </w:t>
       </w:r>
+      <w:proofErr w:type="spellStart"/>
       <w:r>
         <w:rPr>
           <w:rStyle w:val="HTMLCode"/>
@@ -257,9 +480,11 @@
         </w:rPr>
         <w:t>getOverdueTasks</w:t>
       </w:r>
+      <w:proofErr w:type="spellEnd"/>
       <w:r>
         <w:t xml:space="preserve">). The calling code in </w:t>
       </w:r>
+      <w:proofErr w:type="spellStart"/>
       <w:r>
         <w:rPr>
           <w:rStyle w:val="HTMLCode"/>
@@ -269,6 +494,7 @@
         </w:rPr>
         <w:t>TaskManager</w:t>
       </w:r>
+      <w:proofErr w:type="spellEnd"/>
       <w:r>
         <w:t xml:space="preserve"> never knows whether tasks come from a JSON file, a database, or memory.</w:t>
       </w:r>
@@ -315,7 +541,71 @@
     </w:p>
     <w:p>
       <w:r>
-        <w:t>The program uses the TaskManager class to manage priorities in tasks. The priority is initially set during task creating in the createTask function of the TaskManager class. It is updating using the updateTaskPriority class which creates an instance of the TaskPriority enumeratio. It then assigns the object with a new priority and then creates a new task to set the new priority to. The new taks is used to update a task within the TaskManager’s storage.</w:t>
+        <w:t xml:space="preserve">The program uses the </w:t>
+      </w:r>
+      <w:proofErr w:type="spellStart"/>
+      <w:r>
+        <w:t>TaskManager</w:t>
+      </w:r>
+      <w:proofErr w:type="spellEnd"/>
+      <w:r>
+        <w:t xml:space="preserve"> class to manage priorities in tasks. The priority is initially set during task creating in the </w:t>
+      </w:r>
+      <w:proofErr w:type="spellStart"/>
+      <w:r>
+        <w:t>createTask</w:t>
+      </w:r>
+      <w:proofErr w:type="spellEnd"/>
+      <w:r>
+        <w:t xml:space="preserve"> function of the </w:t>
+      </w:r>
+      <w:proofErr w:type="spellStart"/>
+      <w:r>
+        <w:t>TaskManager</w:t>
+      </w:r>
+      <w:proofErr w:type="spellEnd"/>
+      <w:r>
+        <w:t xml:space="preserve"> class. It is updating using the </w:t>
+      </w:r>
+      <w:proofErr w:type="spellStart"/>
+      <w:r>
+        <w:t>updateTaskPriority</w:t>
+      </w:r>
+      <w:proofErr w:type="spellEnd"/>
+      <w:r>
+        <w:t xml:space="preserve"> class which creates an instance of the </w:t>
+      </w:r>
+      <w:proofErr w:type="spellStart"/>
+      <w:r>
+        <w:t>TaskPriority</w:t>
+      </w:r>
+      <w:proofErr w:type="spellEnd"/>
+      <w:r>
+        <w:t xml:space="preserve"> </w:t>
+      </w:r>
+      <w:proofErr w:type="spellStart"/>
+      <w:r>
+        <w:t>enumeratio</w:t>
+      </w:r>
+      <w:proofErr w:type="spellEnd"/>
+      <w:r>
+        <w:t xml:space="preserve">. It then assigns the object with a new priority and then creates a new task to set the new priority to. The new </w:t>
+      </w:r>
+      <w:proofErr w:type="spellStart"/>
+      <w:r>
+        <w:t>taks</w:t>
+      </w:r>
+      <w:proofErr w:type="spellEnd"/>
+      <w:r>
+        <w:t xml:space="preserve"> is used to update a task within the </w:t>
+      </w:r>
+      <w:proofErr w:type="spellStart"/>
+      <w:r>
+        <w:t>TaskManager’s</w:t>
+      </w:r>
+      <w:proofErr w:type="spellEnd"/>
+      <w:r>
+        <w:t xml:space="preserve"> storage.</w:t>
       </w:r>
     </w:p>
     <w:p>
@@ -328,7 +618,23 @@
     </w:p>
     <w:p>
       <w:r>
-        <w:t>The class does not just create a new class and save it as a replacement. Instead it calls the update method from the TaskStorage class which calls the update method</w:t>
+        <w:t xml:space="preserve">The class does not just create a new class and save it as a replacement. </w:t>
+      </w:r>
+      <w:proofErr w:type="gramStart"/>
+      <w:r>
+        <w:t>Instead</w:t>
+      </w:r>
+      <w:proofErr w:type="gramEnd"/>
+      <w:r>
+        <w:t xml:space="preserve"> it calls the update method from the </w:t>
+      </w:r>
+      <w:proofErr w:type="spellStart"/>
+      <w:r>
+        <w:t>TaskStorage</w:t>
+      </w:r>
+      <w:proofErr w:type="spellEnd"/>
+      <w:r>
+        <w:t xml:space="preserve"> class which calls the update method</w:t>
       </w:r>
       <w:r>
         <w:t>, giving it an updated task object. The update method goes through the new task’s attributes and assigns the attributes with values to the original task and saves it in storage.</w:t>
@@ -345,7 +651,31 @@
     </w:p>
     <w:p>
       <w:r>
-        <w:t>The concept of updating an object by creating a update object and extracting fields with data from it and adding them to the original object. Yet the program does not make use of this sttrategy everytime it needs to update an object.</w:t>
+        <w:t xml:space="preserve">The concept of updating an object by creating </w:t>
+      </w:r>
+      <w:proofErr w:type="gramStart"/>
+      <w:r>
+        <w:t>a</w:t>
+      </w:r>
+      <w:proofErr w:type="gramEnd"/>
+      <w:r>
+        <w:t xml:space="preserve"> update object and extracting fields with data from it and adding them to the original object. Yet the program does not make use of this </w:t>
+      </w:r>
+      <w:proofErr w:type="spellStart"/>
+      <w:r>
+        <w:t>sttrategy</w:t>
+      </w:r>
+      <w:proofErr w:type="spellEnd"/>
+      <w:r>
+        <w:t xml:space="preserve"> </w:t>
+      </w:r>
+      <w:proofErr w:type="spellStart"/>
+      <w:r>
+        <w:t>everytime</w:t>
+      </w:r>
+      <w:proofErr w:type="spellEnd"/>
+      <w:r>
+        <w:t xml:space="preserve"> it needs to update an object.</w:t>
       </w:r>
     </w:p>
     <w:p/>
@@ -409,6 +739,9 @@
     </w:p>
     <w:p>
       <w:r>
+        <w:rPr>
+          <w:noProof/>
+        </w:rPr>
         <w:drawing>
           <wp:anchor distT="0" distB="0" distL="114300" distR="114300" simplePos="0" relativeHeight="251658240" behindDoc="1" locked="0" layoutInCell="1" allowOverlap="1" wp14:anchorId="2145158E" wp14:editId="07B42FA8">
             <wp:simplePos x="0" y="0"/>
@@ -492,7 +825,57 @@
     </w:p>
     <w:p>
       <w:r>
-        <w:t xml:space="preserve">Three fields change on the Task object due to a method named markAsDone(). MarkAsDone() cange the status, completedAt and updatedAt attributes of the Task object. </w:t>
+        <w:t xml:space="preserve">Three fields change on the Task object due to a method named </w:t>
+      </w:r>
+      <w:proofErr w:type="spellStart"/>
+      <w:proofErr w:type="gramStart"/>
+      <w:r>
+        <w:t>markAsDone</w:t>
+      </w:r>
+      <w:proofErr w:type="spellEnd"/>
+      <w:r>
+        <w:t>(</w:t>
+      </w:r>
+      <w:proofErr w:type="gramEnd"/>
+      <w:r>
+        <w:t xml:space="preserve">). </w:t>
+      </w:r>
+      <w:proofErr w:type="spellStart"/>
+      <w:proofErr w:type="gramStart"/>
+      <w:r>
+        <w:t>MarkAsDone</w:t>
+      </w:r>
+      <w:proofErr w:type="spellEnd"/>
+      <w:r>
+        <w:t>(</w:t>
+      </w:r>
+      <w:proofErr w:type="gramEnd"/>
+      <w:r>
+        <w:t xml:space="preserve">) </w:t>
+      </w:r>
+      <w:proofErr w:type="spellStart"/>
+      <w:r>
+        <w:t>cange</w:t>
+      </w:r>
+      <w:proofErr w:type="spellEnd"/>
+      <w:r>
+        <w:t xml:space="preserve"> the status, </w:t>
+      </w:r>
+      <w:proofErr w:type="spellStart"/>
+      <w:r>
+        <w:t>completedAt</w:t>
+      </w:r>
+      <w:proofErr w:type="spellEnd"/>
+      <w:r>
+        <w:t xml:space="preserve"> and </w:t>
+      </w:r>
+      <w:proofErr w:type="spellStart"/>
+      <w:r>
+        <w:t>updatedAt</w:t>
+      </w:r>
+      <w:proofErr w:type="spellEnd"/>
+      <w:r>
+        <w:t xml:space="preserve"> attributes of the Task object. </w:t>
       </w:r>
     </w:p>
     <w:p/>
@@ -507,10 +890,222 @@
     <w:p>
       <w:pPr>
         <w:pStyle w:val="Heading2"/>
-      </w:pPr>
-      <w:r>
-        <w:t xml:space="preserve"> </w:t>
-      </w:r>
+        <w:numPr>
+          <w:ilvl w:val="0"/>
+          <w:numId w:val="5"/>
+        </w:numPr>
+        <w:rPr>
+          <w:rFonts w:asciiTheme="minorHAnsi" w:hAnsiTheme="minorHAnsi"/>
+          <w:sz w:val="24"/>
+          <w:szCs w:val="24"/>
+        </w:rPr>
+      </w:pPr>
+      <w:r>
+        <w:rPr>
+          <w:rFonts w:asciiTheme="minorHAnsi" w:hAnsiTheme="minorHAnsi"/>
+          <w:sz w:val="24"/>
+          <w:szCs w:val="24"/>
+        </w:rPr>
+        <w:t>Failure Point 1:</w:t>
+      </w:r>
+    </w:p>
+    <w:p>
+      <w:proofErr w:type="spellStart"/>
+      <w:r>
+        <w:t>TaskStatus.view</w:t>
+      </w:r>
+      <w:proofErr w:type="spellEnd"/>
+      <w:r>
+        <w:t xml:space="preserve">() throws an exception for any input from the CLI that is not in the </w:t>
+      </w:r>
+      <w:proofErr w:type="spellStart"/>
+      <w:r>
+        <w:t>TaskStatus</w:t>
+      </w:r>
+      <w:proofErr w:type="spellEnd"/>
+      <w:r>
+        <w:t xml:space="preserve"> enumeration, yet it is not handled anywhere in the </w:t>
+      </w:r>
+      <w:proofErr w:type="spellStart"/>
+      <w:proofErr w:type="gramStart"/>
+      <w:r>
+        <w:t>updateTaskStatus</w:t>
+      </w:r>
+      <w:proofErr w:type="spellEnd"/>
+      <w:r>
+        <w:t>(</w:t>
+      </w:r>
+      <w:proofErr w:type="gramEnd"/>
+      <w:r>
+        <w:t>) or affected function, so it may cause the system to crash if an invalid input is entered.</w:t>
+      </w:r>
+    </w:p>
+    <w:p>
+      <w:pPr>
+        <w:pStyle w:val="Heading2"/>
+        <w:numPr>
+          <w:ilvl w:val="0"/>
+          <w:numId w:val="5"/>
+        </w:numPr>
+        <w:rPr>
+          <w:rFonts w:asciiTheme="minorHAnsi" w:hAnsiTheme="minorHAnsi"/>
+          <w:sz w:val="24"/>
+          <w:szCs w:val="24"/>
+        </w:rPr>
+      </w:pPr>
+      <w:r>
+        <w:rPr>
+          <w:rFonts w:asciiTheme="minorHAnsi" w:hAnsiTheme="minorHAnsi"/>
+          <w:sz w:val="24"/>
+          <w:szCs w:val="24"/>
+        </w:rPr>
+        <w:lastRenderedPageBreak/>
+        <w:t>Failure Point 2</w:t>
+      </w:r>
+      <w:r>
+        <w:rPr>
+          <w:rFonts w:asciiTheme="minorHAnsi" w:hAnsiTheme="minorHAnsi"/>
+          <w:sz w:val="24"/>
+          <w:szCs w:val="24"/>
+        </w:rPr>
+        <w:t>:</w:t>
+      </w:r>
+    </w:p>
+    <w:p>
+      <w:r>
+        <w:t xml:space="preserve">If </w:t>
+      </w:r>
+      <w:proofErr w:type="spellStart"/>
+      <w:proofErr w:type="gramStart"/>
+      <w:r>
+        <w:t>getTask</w:t>
+      </w:r>
+      <w:proofErr w:type="spellEnd"/>
+      <w:r>
+        <w:t>(</w:t>
+      </w:r>
+      <w:proofErr w:type="gramEnd"/>
+      <w:r>
+        <w:t xml:space="preserve">) returns null, the function </w:t>
+      </w:r>
+      <w:proofErr w:type="spellStart"/>
+      <w:r>
+        <w:t>updateTaskStatus</w:t>
+      </w:r>
+      <w:proofErr w:type="spellEnd"/>
+      <w:r>
+        <w:t>() returns false, so the system will print an error message to the user.</w:t>
+      </w:r>
+    </w:p>
+    <w:p>
+      <w:pPr>
+        <w:pStyle w:val="Heading2"/>
+        <w:numPr>
+          <w:ilvl w:val="0"/>
+          <w:numId w:val="5"/>
+        </w:numPr>
+        <w:rPr>
+          <w:rFonts w:asciiTheme="minorHAnsi" w:hAnsiTheme="minorHAnsi"/>
+          <w:sz w:val="24"/>
+          <w:szCs w:val="24"/>
+        </w:rPr>
+      </w:pPr>
+      <w:r>
+        <w:rPr>
+          <w:rFonts w:asciiTheme="minorHAnsi" w:hAnsiTheme="minorHAnsi"/>
+          <w:sz w:val="24"/>
+          <w:szCs w:val="24"/>
+        </w:rPr>
+        <w:t>Failure Point 3:</w:t>
+      </w:r>
+    </w:p>
+    <w:p>
+      <w:r>
+        <w:t xml:space="preserve">The </w:t>
+      </w:r>
+      <w:proofErr w:type="spellStart"/>
+      <w:r>
+        <w:t>getStorage.save</w:t>
+      </w:r>
+      <w:proofErr w:type="spellEnd"/>
+      <w:r>
+        <w:t xml:space="preserve">() method returns true even if an exception occurred during the file writing process, and the </w:t>
+      </w:r>
+      <w:proofErr w:type="spellStart"/>
+      <w:proofErr w:type="gramStart"/>
+      <w:r>
+        <w:t>updateTaskStatus</w:t>
+      </w:r>
+      <w:proofErr w:type="spellEnd"/>
+      <w:r>
+        <w:t>(</w:t>
+      </w:r>
+      <w:proofErr w:type="gramEnd"/>
+      <w:r>
+        <w:t>) method will return true regardless, reporting file writing success even when the file was not written in storage.</w:t>
+      </w:r>
+    </w:p>
+    <w:p/>
+    <w:p>
+      <w:pPr>
+        <w:pStyle w:val="Heading2"/>
+      </w:pPr>
+      <w:r>
+        <w:t>How the application persists the changes</w:t>
+      </w:r>
+    </w:p>
+    <w:p>
+      <w:r>
+        <w:t>Persistence</w:t>
+      </w:r>
+      <w:r>
+        <w:t xml:space="preserve"> happens through only one method – </w:t>
+      </w:r>
+      <w:proofErr w:type="spellStart"/>
+      <w:r>
+        <w:t>TaskStorage.save</w:t>
+      </w:r>
+      <w:proofErr w:type="spellEnd"/>
+      <w:r>
+        <w:t>().</w:t>
+      </w:r>
+    </w:p>
+    <w:p>
+      <w:r>
+        <w:t xml:space="preserve">This method is called after every mutation. The </w:t>
+      </w:r>
+      <w:proofErr w:type="spellStart"/>
+      <w:r>
+        <w:t>TaskStorage</w:t>
+      </w:r>
+      <w:proofErr w:type="spellEnd"/>
+      <w:r>
+        <w:t xml:space="preserve"> class keeps 2 copies of the same data </w:t>
+      </w:r>
+      <w:r>
+        <w:t>simultaneously</w:t>
+      </w:r>
+      <w:r>
+        <w:t xml:space="preserve">. First, a hash map containing all the </w:t>
+      </w:r>
+      <w:r>
+        <w:t xml:space="preserve">task data. When a task is updated or changed, the entire hash map is serialized as an array to be stored in the second copy – </w:t>
+      </w:r>
+      <w:proofErr w:type="spellStart"/>
+      <w:proofErr w:type="gramStart"/>
+      <w:r>
+        <w:t>tasks.json</w:t>
+      </w:r>
+      <w:proofErr w:type="spellEnd"/>
+      <w:proofErr w:type="gramEnd"/>
+      <w:r>
+        <w:t xml:space="preserve"> – a file on the disk. </w:t>
+      </w:r>
+    </w:p>
+    <w:p>
+      <w:pPr>
+        <w:pStyle w:val="Heading2"/>
+      </w:pPr>
     </w:p>
     <w:sectPr>
       <w:pgSz w:w="12240" w:h="15840"/>
@@ -783,6 +1378,155 @@
     </w:lvl>
   </w:abstractNum>
   <w:abstractNum w:abstractNumId="3" w15:restartNumberingAfterBreak="0">
+    <w:nsid w:val="65413F80"/>
+    <w:multiLevelType w:val="multilevel"/>
+    <w:tmpl w:val="A19428FA"/>
+    <w:lvl w:ilvl="0">
+      <w:start w:val="1"/>
+      <w:numFmt w:val="bullet"/>
+      <w:lvlText w:val=""/>
+      <w:lvlJc w:val="left"/>
+      <w:pPr>
+        <w:tabs>
+          <w:tab w:val="num" w:pos="720"/>
+        </w:tabs>
+        <w:ind w:left="720" w:hanging="360"/>
+      </w:pPr>
+      <w:rPr>
+        <w:rFonts w:ascii="Symbol" w:hAnsi="Symbol" w:hint="default"/>
+        <w:sz w:val="20"/>
+      </w:rPr>
+    </w:lvl>
+    <w:lvl w:ilvl="1" w:tentative="1">
+      <w:start w:val="1"/>
+      <w:numFmt w:val="bullet"/>
+      <w:lvlText w:val="o"/>
+      <w:lvlJc w:val="left"/>
+      <w:pPr>
+        <w:tabs>
+          <w:tab w:val="num" w:pos="1440"/>
+        </w:tabs>
+        <w:ind w:left="1440" w:hanging="360"/>
+      </w:pPr>
+      <w:rPr>
+        <w:rFonts w:ascii="Courier New" w:hAnsi="Courier New" w:hint="default"/>
+        <w:sz w:val="20"/>
+      </w:rPr>
+    </w:lvl>
+    <w:lvl w:ilvl="2" w:tentative="1">
+      <w:start w:val="1"/>
+      <w:numFmt w:val="bullet"/>
+      <w:lvlText w:val=""/>
+      <w:lvlJc w:val="left"/>
+      <w:pPr>
+        <w:tabs>
+          <w:tab w:val="num" w:pos="2160"/>
+        </w:tabs>
+        <w:ind w:left="2160" w:hanging="360"/>
+      </w:pPr>
+      <w:rPr>
+        <w:rFonts w:ascii="Wingdings" w:hAnsi="Wingdings" w:hint="default"/>
+        <w:sz w:val="20"/>
+      </w:rPr>
+    </w:lvl>
+    <w:lvl w:ilvl="3" w:tentative="1">
+      <w:start w:val="1"/>
+      <w:numFmt w:val="bullet"/>
+      <w:lvlText w:val=""/>
+      <w:lvlJc w:val="left"/>
+      <w:pPr>
+        <w:tabs>
+          <w:tab w:val="num" w:pos="2880"/>
+        </w:tabs>
+        <w:ind w:left="2880" w:hanging="360"/>
+      </w:pPr>
+      <w:rPr>
+        <w:rFonts w:ascii="Wingdings" w:hAnsi="Wingdings" w:hint="default"/>
+        <w:sz w:val="20"/>
+      </w:rPr>
+    </w:lvl>
+    <w:lvl w:ilvl="4" w:tentative="1">
+      <w:start w:val="1"/>
+      <w:numFmt w:val="bullet"/>
+      <w:lvlText w:val=""/>
+      <w:lvlJc w:val="left"/>
+      <w:pPr>
+        <w:tabs>
+          <w:tab w:val="num" w:pos="3600"/>
+        </w:tabs>
+        <w:ind w:left="3600" w:hanging="360"/>
+      </w:pPr>
+      <w:rPr>
+        <w:rFonts w:ascii="Wingdings" w:hAnsi="Wingdings" w:hint="default"/>
+        <w:sz w:val="20"/>
+      </w:rPr>
+    </w:lvl>
+    <w:lvl w:ilvl="5" w:tentative="1">
+      <w:start w:val="1"/>
+      <w:numFmt w:val="bullet"/>
+      <w:lvlText w:val=""/>
+      <w:lvlJc w:val="left"/>
+      <w:pPr>
+        <w:tabs>
+          <w:tab w:val="num" w:pos="4320"/>
+        </w:tabs>
+        <w:ind w:left="4320" w:hanging="360"/>
+      </w:pPr>
+      <w:rPr>
+        <w:rFonts w:ascii="Wingdings" w:hAnsi="Wingdings" w:hint="default"/>
+        <w:sz w:val="20"/>
+      </w:rPr>
+    </w:lvl>
+    <w:lvl w:ilvl="6" w:tentative="1">
+      <w:start w:val="1"/>
+      <w:numFmt w:val="bullet"/>
+      <w:lvlText w:val=""/>
+      <w:lvlJc w:val="left"/>
+      <w:pPr>
+        <w:tabs>
+          <w:tab w:val="num" w:pos="5040"/>
+        </w:tabs>
+        <w:ind w:left="5040" w:hanging="360"/>
+      </w:pPr>
+      <w:rPr>
+        <w:rFonts w:ascii="Wingdings" w:hAnsi="Wingdings" w:hint="default"/>
+        <w:sz w:val="20"/>
+      </w:rPr>
+    </w:lvl>
+    <w:lvl w:ilvl="7" w:tentative="1">
+      <w:start w:val="1"/>
+      <w:numFmt w:val="bullet"/>
+      <w:lvlText w:val=""/>
+      <w:lvlJc w:val="left"/>
+      <w:pPr>
+        <w:tabs>
+          <w:tab w:val="num" w:pos="5760"/>
+        </w:tabs>
+        <w:ind w:left="5760" w:hanging="360"/>
+      </w:pPr>
+      <w:rPr>
+        <w:rFonts w:ascii="Wingdings" w:hAnsi="Wingdings" w:hint="default"/>
+        <w:sz w:val="20"/>
+      </w:rPr>
+    </w:lvl>
+    <w:lvl w:ilvl="8" w:tentative="1">
+      <w:start w:val="1"/>
+      <w:numFmt w:val="bullet"/>
+      <w:lvlText w:val=""/>
+      <w:lvlJc w:val="left"/>
+      <w:pPr>
+        <w:tabs>
+          <w:tab w:val="num" w:pos="6480"/>
+        </w:tabs>
+        <w:ind w:left="6480" w:hanging="360"/>
+      </w:pPr>
+      <w:rPr>
+        <w:rFonts w:ascii="Wingdings" w:hAnsi="Wingdings" w:hint="default"/>
+        <w:sz w:val="20"/>
+      </w:rPr>
+    </w:lvl>
+  </w:abstractNum>
+  <w:abstractNum w:abstractNumId="4" w15:restartNumberingAfterBreak="0">
     <w:nsid w:val="70467B50"/>
     <w:multiLevelType w:val="hybridMultilevel"/>
     <w:tmpl w:val="0870327E"/>
@@ -895,8 +1639,94 @@
       </w:rPr>
     </w:lvl>
   </w:abstractNum>
+  <w:abstractNum w:abstractNumId="5" w15:restartNumberingAfterBreak="0">
+    <w:nsid w:val="785A70F1"/>
+    <w:multiLevelType w:val="hybridMultilevel"/>
+    <w:tmpl w:val="35B85930"/>
+    <w:lvl w:ilvl="0" w:tplc="0409000F">
+      <w:start w:val="1"/>
+      <w:numFmt w:val="decimal"/>
+      <w:lvlText w:val="%1."/>
+      <w:lvlJc w:val="left"/>
+      <w:pPr>
+        <w:ind w:left="780" w:hanging="360"/>
+      </w:pPr>
+    </w:lvl>
+    <w:lvl w:ilvl="1" w:tplc="04090019" w:tentative="1">
+      <w:start w:val="1"/>
+      <w:numFmt w:val="lowerLetter"/>
+      <w:lvlText w:val="%2."/>
+      <w:lvlJc w:val="left"/>
+      <w:pPr>
+        <w:ind w:left="1500" w:hanging="360"/>
+      </w:pPr>
+    </w:lvl>
+    <w:lvl w:ilvl="2" w:tplc="0409001B" w:tentative="1">
+      <w:start w:val="1"/>
+      <w:numFmt w:val="lowerRoman"/>
+      <w:lvlText w:val="%3."/>
+      <w:lvlJc w:val="right"/>
+      <w:pPr>
+        <w:ind w:left="2220" w:hanging="180"/>
+      </w:pPr>
+    </w:lvl>
+    <w:lvl w:ilvl="3" w:tplc="0409000F" w:tentative="1">
+      <w:start w:val="1"/>
+      <w:numFmt w:val="decimal"/>
+      <w:lvlText w:val="%4."/>
+      <w:lvlJc w:val="left"/>
+      <w:pPr>
+        <w:ind w:left="2940" w:hanging="360"/>
+      </w:pPr>
+    </w:lvl>
+    <w:lvl w:ilvl="4" w:tplc="04090019" w:tentative="1">
+      <w:start w:val="1"/>
+      <w:numFmt w:val="lowerLetter"/>
+      <w:lvlText w:val="%5."/>
+      <w:lvlJc w:val="left"/>
+      <w:pPr>
+        <w:ind w:left="3660" w:hanging="360"/>
+      </w:pPr>
+    </w:lvl>
+    <w:lvl w:ilvl="5" w:tplc="0409001B" w:tentative="1">
+      <w:start w:val="1"/>
+      <w:numFmt w:val="lowerRoman"/>
+      <w:lvlText w:val="%6."/>
+      <w:lvlJc w:val="right"/>
+      <w:pPr>
+        <w:ind w:left="4380" w:hanging="180"/>
+      </w:pPr>
+    </w:lvl>
+    <w:lvl w:ilvl="6" w:tplc="0409000F" w:tentative="1">
+      <w:start w:val="1"/>
+      <w:numFmt w:val="decimal"/>
+      <w:lvlText w:val="%7."/>
+      <w:lvlJc w:val="left"/>
+      <w:pPr>
+        <w:ind w:left="5100" w:hanging="360"/>
+      </w:pPr>
+    </w:lvl>
+    <w:lvl w:ilvl="7" w:tplc="04090019" w:tentative="1">
+      <w:start w:val="1"/>
+      <w:numFmt w:val="lowerLetter"/>
+      <w:lvlText w:val="%8."/>
+      <w:lvlJc w:val="left"/>
+      <w:pPr>
+        <w:ind w:left="5820" w:hanging="360"/>
+      </w:pPr>
+    </w:lvl>
+    <w:lvl w:ilvl="8" w:tplc="0409001B" w:tentative="1">
+      <w:start w:val="1"/>
+      <w:numFmt w:val="lowerRoman"/>
+      <w:lvlText w:val="%9."/>
+      <w:lvlJc w:val="right"/>
+      <w:pPr>
+        <w:ind w:left="6540" w:hanging="180"/>
+      </w:pPr>
+    </w:lvl>
+  </w:abstractNum>
   <w:num w:numId="1" w16cid:durableId="1188131309">
-    <w:abstractNumId w:val="3"/>
+    <w:abstractNumId w:val="4"/>
   </w:num>
   <w:num w:numId="2" w16cid:durableId="255024101">
     <w:abstractNumId w:val="1"/>
@@ -906,6 +1736,12 @@
   </w:num>
   <w:num w:numId="4" w16cid:durableId="209270688">
     <w:abstractNumId w:val="2"/>
+  </w:num>
+  <w:num w:numId="5" w16cid:durableId="1715084632">
+    <w:abstractNumId w:val="5"/>
+  </w:num>
+  <w:num w:numId="6" w16cid:durableId="882907826">
+    <w:abstractNumId w:val="3"/>
   </w:num>
 </w:numbering>
 </file>
@@ -1849,6 +2685,24 @@
       <w:bCs/>
     </w:rPr>
   </w:style>
+  <w:style w:type="paragraph" w:styleId="NormalWeb">
+    <w:name w:val="Normal (Web)"/>
+    <w:basedOn w:val="Normal"/>
+    <w:uiPriority w:val="99"/>
+    <w:semiHidden/>
+    <w:unhideWhenUsed/>
+    <w:rsid w:val="008C5C57"/>
+    <w:pPr>
+      <w:spacing w:before="100" w:beforeAutospacing="1" w:after="100" w:afterAutospacing="1" w:line="240" w:lineRule="auto"/>
+    </w:pPr>
+    <w:rPr>
+      <w:rFonts w:ascii="Times New Roman" w:eastAsia="Times New Roman" w:hAnsi="Times New Roman" w:cs="Times New Roman"/>
+      <w:kern w:val="0"/>
+      <w:sz w:val="24"/>
+      <w:szCs w:val="24"/>
+      <w14:ligatures w14:val="none"/>
+    </w:rPr>
+  </w:style>
 </w:styles>
 </file>
 

</xml_diff>